<commit_message>
Data responsibilities agreement: platform operator is vAI, not Impact Mining, Inc.
Co-Authored-By: Claude Sonnet 5.5 <noreply@anthropic.com>
</commit_message>
<xml_diff>
--- a/docs/forms/Data responsibilities agreement.docx
+++ b/docs/forms/Data responsibilities agreement.docx
@@ -28,7 +28,7 @@
         <w:t>Draft template for a lawyer to adapt. Not legal advice.</w:t>
       </w:r>
       <w:r>
-        <w:t xml:space="preserve"> Use one agreement per partner: (a) Impact Mining, Inc. and the Davidson AI Futures Lab (Oloibiri, Nigeria); (b) Impact Mining, Inc. and Maji Mazuri (Kenya); (c) any later partner. Fill the </w:t>
+        <w:t xml:space="preserve"> Use one agreement per partner: (a) vAI and Maji Mazuri (Kenya); (b) any later partner. The Davidson AI Futures Lab (Oloibiri, Nigeria) is part of vAI; ask the lawyer whether it also needs its own agreement for Oloibiri learners. Fill the </w:t>
       </w:r>
       <w:r>
         <w:rPr>
@@ -37,7 +37,7 @@
         <w:t>[brackets]</w:t>
       </w:r>
       <w:r>
-        <w:t>. Sign after the entity is official.</w:t>
+        <w:t>.</w:t>
       </w:r>
     </w:p>
     <w:p>
@@ -48,13 +48,22 @@
         <w:t>Parties:</w:t>
       </w:r>
       <w:r>
-        <w:t xml:space="preserve"> Impact Mining, Inc., an Ohio nonprofit corporation, </w:t>
+        <w:t xml:space="preserve"> </w:t>
       </w:r>
       <w:r>
         <w:rPr>
           <w:b/>
         </w:rPr>
-        <w:t>[address]</w:t>
+        <w:t>vAI</w:t>
+      </w:r>
+      <w:r>
+        <w:t xml:space="preserve">, the nextVillage.community program run by the Davidson AI Futures Lab (Oloibiri, Bayelsa State, Nigeria) together with Kevin Hallinan, </w:t>
+      </w:r>
+      <w:r>
+        <w:rPr>
+          <w:b/>
+        </w:rPr>
+        <w:t>[legal form and address; lawyer to confirm]</w:t>
       </w:r>
       <w:r>
         <w:t xml:space="preserve"> ("the Platform Operator"); and </w:t>

</xml_diff>

<commit_message>
Data responsibilities agreement: platform operator is vAI, not Impact Mining, Inc. (#315)
Co-authored-by: Claude Sonnet 5.5 <noreply@anthropic.com>
</commit_message>
<xml_diff>
--- a/docs/forms/Data responsibilities agreement.docx
+++ b/docs/forms/Data responsibilities agreement.docx
@@ -28,7 +28,7 @@
         <w:t>Draft template for a lawyer to adapt. Not legal advice.</w:t>
       </w:r>
       <w:r>
-        <w:t xml:space="preserve"> Use one agreement per partner: (a) Impact Mining, Inc. and the Davidson AI Futures Lab (Oloibiri, Nigeria); (b) Impact Mining, Inc. and Maji Mazuri (Kenya); (c) any later partner. Fill the </w:t>
+        <w:t xml:space="preserve"> Use one agreement per partner: (a) vAI and Maji Mazuri (Kenya); (b) any later partner. The Davidson AI Futures Lab (Oloibiri, Nigeria) is part of vAI; ask the lawyer whether it also needs its own agreement for Oloibiri learners. Fill the </w:t>
       </w:r>
       <w:r>
         <w:rPr>
@@ -37,7 +37,7 @@
         <w:t>[brackets]</w:t>
       </w:r>
       <w:r>
-        <w:t>. Sign after the entity is official.</w:t>
+        <w:t>.</w:t>
       </w:r>
     </w:p>
     <w:p>
@@ -48,13 +48,22 @@
         <w:t>Parties:</w:t>
       </w:r>
       <w:r>
-        <w:t xml:space="preserve"> Impact Mining, Inc., an Ohio nonprofit corporation, </w:t>
+        <w:t xml:space="preserve"> </w:t>
       </w:r>
       <w:r>
         <w:rPr>
           <w:b/>
         </w:rPr>
-        <w:t>[address]</w:t>
+        <w:t>vAI</w:t>
+      </w:r>
+      <w:r>
+        <w:t xml:space="preserve">, the nextVillage.community program run by the Davidson AI Futures Lab (Oloibiri, Bayelsa State, Nigeria) together with Kevin Hallinan, </w:t>
+      </w:r>
+      <w:r>
+        <w:rPr>
+          <w:b/>
+        </w:rPr>
+        <w:t>[legal form and address; lawyer to confirm]</w:t>
       </w:r>
       <w:r>
         <w:t xml:space="preserve"> ("the Platform Operator"); and </w:t>

</xml_diff>